<commit_message>
added changes to document reflecting use of 2 batteries
</commit_message>
<xml_diff>
--- a/Documentation.docx
+++ b/Documentation.docx
@@ -984,7 +984,19 @@
         <w:rPr>
           <w:rFonts w:ascii="Times New Roman" w:hAnsi="Times New Roman" w:cs="Times New Roman"/>
         </w:rPr>
-        <w:t>, batteries, sensors and microprocessors cannot be stored elsewhere on the buggy without the use of a slipring or modification of the buggy shell. This leaves a XXXX space to fit a measurement probe.</w:t>
+        <w:t xml:space="preserve">, batteries, sensors and microprocessors cannot be stored elsewhere on the buggy without the use of a slipring or modification of the buggy shell. This leaves </w:t>
+      </w:r>
+      <w:r>
+        <w:rPr>
+          <w:rFonts w:ascii="Times New Roman" w:hAnsi="Times New Roman" w:cs="Times New Roman"/>
+        </w:rPr>
+        <w:t>~2-3 cubic inches of</w:t>
+      </w:r>
+      <w:r>
+        <w:rPr>
+          <w:rFonts w:ascii="Times New Roman" w:hAnsi="Times New Roman" w:cs="Times New Roman"/>
+        </w:rPr>
+        <w:t xml:space="preserve"> space to fit a measurement probe.</w:t>
       </w:r>
     </w:p>
     <w:p>
@@ -1089,7 +1101,19 @@
         <w:rPr>
           <w:rFonts w:ascii="Times New Roman" w:hAnsi="Times New Roman" w:cs="Times New Roman"/>
         </w:rPr>
-        <w:t xml:space="preserve"> CR2</w:t>
+        <w:t xml:space="preserve"> </w:t>
+      </w:r>
+      <w:r>
+        <w:rPr>
+          <w:rFonts w:ascii="Times New Roman" w:hAnsi="Times New Roman" w:cs="Times New Roman"/>
+        </w:rPr>
+        <w:t xml:space="preserve">of </w:t>
+      </w:r>
+      <w:r>
+        <w:rPr>
+          <w:rFonts w:ascii="Times New Roman" w:hAnsi="Times New Roman" w:cs="Times New Roman"/>
+        </w:rPr>
+        <w:t>CR2</w:t>
       </w:r>
       <w:r>
         <w:rPr>
@@ -1137,27 +1161,106 @@
         <w:rPr>
           <w:rFonts w:ascii="Times New Roman" w:hAnsi="Times New Roman" w:cs="Times New Roman"/>
         </w:rPr>
-        <w:t xml:space="preserve">. Originally I had </w:t>
+        <w:t xml:space="preserve">. </w:t>
+      </w:r>
+      <w:r>
+        <w:rPr>
+          <w:rFonts w:ascii="Times New Roman" w:hAnsi="Times New Roman" w:cs="Times New Roman"/>
+        </w:rPr>
+        <w:t>Originally,</w:t>
+      </w:r>
+      <w:r>
+        <w:rPr>
+          <w:rFonts w:ascii="Times New Roman" w:hAnsi="Times New Roman" w:cs="Times New Roman"/>
+        </w:rPr>
+        <w:t xml:space="preserve"> I had desired to use a single CR2032 to power the Arduino as it would allow the probe to fit between a </w:t>
       </w:r>
       <w:r>
         <w:rPr>
           <w:rFonts w:ascii="Times New Roman" w:hAnsi="Times New Roman" w:cs="Times New Roman"/>
         </w:rPr>
         <w:lastRenderedPageBreak/>
-        <w:t xml:space="preserve">desired to use a single CR2032 to power the Arduino as it would allow the probe to fit between a single gap between the spokes of the wheel. However, the flash memory that </w:t>
-      </w:r>
-    </w:p>
-    <w:p>
-      <w:pPr>
-        <w:rPr>
-          <w:rFonts w:ascii="Times New Roman" w:hAnsi="Times New Roman" w:cs="Times New Roman"/>
-        </w:rPr>
-      </w:pPr>
-      <w:r>
-        <w:rPr>
-          <w:rFonts w:ascii="Times New Roman" w:hAnsi="Times New Roman" w:cs="Times New Roman"/>
-        </w:rPr>
-        <w:t>It is crucial that a Lithium Primary cell is used. A Lithium Polymer (LiPo) battery will combust at the temperatures that this probe needs to operate at. The Lithium Primary cell is rated past 200F, making it a safe choice for this project.</w:t>
+        <w:t xml:space="preserve">single gap between the spokes of the wheel. </w:t>
+      </w:r>
+      <w:r>
+        <w:rPr>
+          <w:rFonts w:ascii="Times New Roman" w:hAnsi="Times New Roman" w:cs="Times New Roman"/>
+        </w:rPr>
+        <w:t>However, in testing, the CR2032 batteries only provided ~3.0-3.1v. The Arduino’s voltage controller is unable to power the device with this low of a voltage. I could skip the voltage controller and provide the coin cell’s power straight in to the Arduinos VCC but that raises more issues. As lithium batteries heat up, their voltage drops. Without going through the voltage controller, brownouts can occur that could cause permanent damage to the device. The storage solution that I use also has peak current draws that would exceed one coin cell’s peak current. This could be compensated with large capacitors, but that would defeat the point of only using one battery.</w:t>
+      </w:r>
+    </w:p>
+    <w:p>
+      <w:pPr>
+        <w:rPr>
+          <w:rFonts w:ascii="Times New Roman" w:hAnsi="Times New Roman" w:cs="Times New Roman"/>
+        </w:rPr>
+      </w:pPr>
+      <w:r>
+        <w:rPr>
+          <w:rFonts w:ascii="Times New Roman" w:hAnsi="Times New Roman" w:cs="Times New Roman"/>
+        </w:rPr>
+        <w:t>The current solution uses 2 CR2032 coin cells wired in series to provide ~6 volts to the Arduino’s voltage controller. This solution is resilient to the drops in voltage due to heat and will be able to withstand the current spikes demanded by the flash module’s writing. I also make use of a XXX uF ceramic capacitor to smooth the power and XXX uF Electrolytic capacitors to help with voltage dips when the flash memory writes.</w:t>
+      </w:r>
+    </w:p>
+    <w:p>
+      <w:pPr>
+        <w:rPr>
+          <w:rFonts w:ascii="Times New Roman" w:hAnsi="Times New Roman" w:cs="Times New Roman"/>
+        </w:rPr>
+      </w:pPr>
+      <w:r>
+        <w:rPr>
+          <w:rFonts w:ascii="Times New Roman" w:hAnsi="Times New Roman" w:cs="Times New Roman"/>
+        </w:rPr>
+        <w:t>It is crucial that Lithium Primary cell</w:t>
+      </w:r>
+      <w:r>
+        <w:rPr>
+          <w:rFonts w:ascii="Times New Roman" w:hAnsi="Times New Roman" w:cs="Times New Roman"/>
+        </w:rPr>
+        <w:t>s are</w:t>
+      </w:r>
+      <w:r>
+        <w:rPr>
+          <w:rFonts w:ascii="Times New Roman" w:hAnsi="Times New Roman" w:cs="Times New Roman"/>
+        </w:rPr>
+        <w:t xml:space="preserve"> used. A Lithium Polymer (LiPo) battery will combust at the temperatures that this probe needs to operate at. Lithium Primary cell</w:t>
+      </w:r>
+      <w:r>
+        <w:rPr>
+          <w:rFonts w:ascii="Times New Roman" w:hAnsi="Times New Roman" w:cs="Times New Roman"/>
+        </w:rPr>
+        <w:t>s</w:t>
+      </w:r>
+      <w:r>
+        <w:rPr>
+          <w:rFonts w:ascii="Times New Roman" w:hAnsi="Times New Roman" w:cs="Times New Roman"/>
+        </w:rPr>
+        <w:t xml:space="preserve"> </w:t>
+      </w:r>
+      <w:r>
+        <w:rPr>
+          <w:rFonts w:ascii="Times New Roman" w:hAnsi="Times New Roman" w:cs="Times New Roman"/>
+        </w:rPr>
+        <w:t>are</w:t>
+      </w:r>
+      <w:r>
+        <w:rPr>
+          <w:rFonts w:ascii="Times New Roman" w:hAnsi="Times New Roman" w:cs="Times New Roman"/>
+        </w:rPr>
+        <w:t xml:space="preserve"> rated past 200F, making </w:t>
+      </w:r>
+      <w:r>
+        <w:rPr>
+          <w:rFonts w:ascii="Times New Roman" w:hAnsi="Times New Roman" w:cs="Times New Roman"/>
+        </w:rPr>
+        <w:t>them</w:t>
+      </w:r>
+      <w:r>
+        <w:rPr>
+          <w:rFonts w:ascii="Times New Roman" w:hAnsi="Times New Roman" w:cs="Times New Roman"/>
+        </w:rPr>
+        <w:t xml:space="preserve"> a safe choice for this project.</w:t>
       </w:r>
     </w:p>
     <w:p>
@@ -1200,14 +1303,12 @@
         </w:rPr>
         <w:t xml:space="preserve">timestamp] datapoints. Arduinos also </w:t>
       </w:r>
-      <w:proofErr w:type="spellStart"/>
-      <w:r>
-        <w:rPr>
-          <w:rFonts w:ascii="Times New Roman" w:hAnsi="Times New Roman" w:cs="Times New Roman"/>
-        </w:rPr>
-        <w:t>posses</w:t>
-      </w:r>
-      <w:proofErr w:type="spellEnd"/>
+      <w:r>
+        <w:rPr>
+          <w:rFonts w:ascii="Times New Roman" w:hAnsi="Times New Roman" w:cs="Times New Roman"/>
+        </w:rPr>
+        <w:t>possess</w:t>
+      </w:r>
       <w:r>
         <w:rPr>
           <w:rFonts w:ascii="Times New Roman" w:hAnsi="Times New Roman" w:cs="Times New Roman"/>
@@ -1378,6 +1479,7 @@
       </w:pPr>
       <w:bookmarkStart w:id="8" w:name="_Toc213933299"/>
       <w:r>
+        <w:lastRenderedPageBreak/>
         <w:t>Probe Case</w:t>
       </w:r>
       <w:bookmarkEnd w:id="8"/>
@@ -1422,16 +1524,14 @@
         <w:rPr>
           <w:rFonts w:ascii="Times New Roman" w:hAnsi="Times New Roman" w:cs="Times New Roman"/>
         </w:rPr>
-        <w:t xml:space="preserve"> </w:t>
-      </w:r>
-      <w:proofErr w:type="spellStart"/>
-      <w:r>
-        <w:rPr>
-          <w:rFonts w:ascii="Times New Roman" w:hAnsi="Times New Roman" w:cs="Times New Roman"/>
-        </w:rPr>
-        <w:t>Polymaker</w:t>
-      </w:r>
-      <w:proofErr w:type="spellEnd"/>
+        <w:t xml:space="preserve"> Polymaker</w:t>
+      </w:r>
+      <w:r>
+        <w:rPr>
+          <w:rFonts w:ascii="Times New Roman" w:hAnsi="Times New Roman" w:cs="Times New Roman"/>
+        </w:rPr>
+        <w:t>’s</w:t>
+      </w:r>
       <w:r>
         <w:rPr>
           <w:rFonts w:ascii="Times New Roman" w:hAnsi="Times New Roman" w:cs="Times New Roman"/>
@@ -1452,119 +1552,131 @@
       </w:pPr>
       <w:bookmarkStart w:id="9" w:name="_Toc213933300"/>
       <w:r>
+        <w:t>Code Summary</w:t>
+      </w:r>
+      <w:bookmarkEnd w:id="9"/>
+    </w:p>
+    <w:p>
+      <w:pPr>
+        <w:rPr>
+          <w:rFonts w:ascii="Times New Roman" w:hAnsi="Times New Roman" w:cs="Times New Roman"/>
+        </w:rPr>
+      </w:pPr>
+      <w:r>
+        <w:rPr>
+          <w:rFonts w:ascii="Times New Roman" w:hAnsi="Times New Roman" w:cs="Times New Roman"/>
+        </w:rPr>
+        <w:t xml:space="preserve">The code that runs on the Arduino starts by </w:t>
+      </w:r>
+      <w:r>
+        <w:rPr>
+          <w:rFonts w:ascii="Times New Roman" w:hAnsi="Times New Roman" w:cs="Times New Roman"/>
+        </w:rPr>
+        <w:t>initializing key variables and data structures. As mention</w:t>
+      </w:r>
+      <w:r>
+        <w:rPr>
+          <w:rFonts w:ascii="Times New Roman" w:hAnsi="Times New Roman" w:cs="Times New Roman"/>
+        </w:rPr>
+        <w:t>ed</w:t>
+      </w:r>
+      <w:r>
+        <w:rPr>
+          <w:rFonts w:ascii="Times New Roman" w:hAnsi="Times New Roman" w:cs="Times New Roman"/>
+        </w:rPr>
+        <w:t xml:space="preserve"> before, each datapoint is a temperature timestamp pair where the temperature is an unsigned 8-bit integer and the timestamp is an unsigned 16-bit integer. This gives us a temperature range of 0-255 Fahrenheit and a timestamp range of 0-65536. Our expected temperature readings are not expected to go past 170F, leaving us a good margin of safety. </w:t>
+      </w:r>
+    </w:p>
+    <w:p>
+      <w:pPr>
+        <w:rPr>
+          <w:rFonts w:ascii="Times New Roman" w:hAnsi="Times New Roman" w:cs="Times New Roman"/>
+        </w:rPr>
+      </w:pPr>
+      <w:r>
+        <w:rPr>
+          <w:rFonts w:ascii="Times New Roman" w:hAnsi="Times New Roman" w:cs="Times New Roman"/>
+        </w:rPr>
+        <w:t xml:space="preserve">The probe is controlled by a single button. A short press of the button will begin a testing sequence </w:t>
+      </w:r>
+      <w:r>
+        <w:rPr>
+          <w:rFonts w:ascii="Times New Roman" w:hAnsi="Times New Roman" w:cs="Times New Roman"/>
+        </w:rPr>
+        <w:t>while</w:t>
+      </w:r>
+      <w:r>
+        <w:rPr>
+          <w:rFonts w:ascii="Times New Roman" w:hAnsi="Times New Roman" w:cs="Times New Roman"/>
+        </w:rPr>
+        <w:t xml:space="preserve"> holding the button for several seconds will begin data transfer. The testing sequence begins a loop of reading analog inputs from the thermistor and converting it to Fahrenheit via the Steinhart-Hart equation. These datapoints are saved into a buffer. After the buffer fills up, or the test ends, the buffer is written to the flash storage module.</w:t>
+      </w:r>
+      <w:r>
+        <w:rPr>
+          <w:rFonts w:ascii="Times New Roman" w:hAnsi="Times New Roman" w:cs="Times New Roman"/>
+        </w:rPr>
+        <w:t xml:space="preserve"> Currently, measurements are taken once per second.</w:t>
+      </w:r>
+    </w:p>
+    <w:p>
+      <w:pPr>
+        <w:rPr>
+          <w:rFonts w:ascii="Times New Roman" w:hAnsi="Times New Roman" w:cs="Times New Roman"/>
+        </w:rPr>
+      </w:pPr>
+      <w:r>
+        <w:rPr>
+          <w:rFonts w:ascii="Times New Roman" w:hAnsi="Times New Roman" w:cs="Times New Roman"/>
+        </w:rPr>
+        <w:t>The data transfer function relies on a UART serial connection to a computer. After plugging in the RX and TX pins, the Arduino can read all of the stored data from flash and print them out to a terminal on your PC for analysis.</w:t>
+      </w:r>
+    </w:p>
+    <w:p>
+      <w:pPr>
+        <w:rPr>
+          <w:rFonts w:ascii="Times New Roman" w:hAnsi="Times New Roman" w:cs="Times New Roman"/>
+        </w:rPr>
+      </w:pPr>
+    </w:p>
+    <w:p>
+      <w:pPr>
+        <w:pStyle w:val="Heading1"/>
+      </w:pPr>
+      <w:bookmarkStart w:id="10" w:name="_Toc213933301"/>
+      <w:r>
+        <w:t>Future Improvements</w:t>
+      </w:r>
+      <w:bookmarkEnd w:id="10"/>
+    </w:p>
+    <w:p>
+      <w:pPr>
+        <w:pStyle w:val="Heading2"/>
+      </w:pPr>
+      <w:bookmarkStart w:id="11" w:name="_Toc213933302"/>
+      <w:r>
+        <w:t>Code Improvements</w:t>
+      </w:r>
+      <w:bookmarkEnd w:id="11"/>
+    </w:p>
+    <w:p>
+      <w:pPr>
+        <w:rPr>
+          <w:rFonts w:ascii="Times New Roman" w:hAnsi="Times New Roman" w:cs="Times New Roman"/>
+        </w:rPr>
+      </w:pPr>
+      <w:r>
+        <w:rPr>
+          <w:rFonts w:ascii="Times New Roman" w:hAnsi="Times New Roman" w:cs="Times New Roman"/>
+        </w:rPr>
+        <w:t>There are several areas in which the code can be improved. Right now, the constants used for the Steinhart-Hart equation are general ones for the given 10kOhm resistor and 10kOhm thermistor pair. To get a more accurate Fahrenheit reading, it would be better to calibrate these constants. For the purposes of measuring the decay in thermal energy, this isn’t as critical, but would help provide more useful information.</w:t>
+      </w:r>
+    </w:p>
+    <w:p>
+      <w:pPr>
+        <w:pStyle w:val="Heading2"/>
+      </w:pPr>
+      <w:r>
         <w:lastRenderedPageBreak/>
-        <w:t>Code Summary</w:t>
-      </w:r>
-      <w:bookmarkEnd w:id="9"/>
-    </w:p>
-    <w:p>
-      <w:pPr>
-        <w:rPr>
-          <w:rFonts w:ascii="Times New Roman" w:hAnsi="Times New Roman" w:cs="Times New Roman"/>
-        </w:rPr>
-      </w:pPr>
-      <w:r>
-        <w:rPr>
-          <w:rFonts w:ascii="Times New Roman" w:hAnsi="Times New Roman" w:cs="Times New Roman"/>
-        </w:rPr>
-        <w:t xml:space="preserve">The code that runs on the Arduino starts by </w:t>
-      </w:r>
-      <w:r>
-        <w:rPr>
-          <w:rFonts w:ascii="Times New Roman" w:hAnsi="Times New Roman" w:cs="Times New Roman"/>
-        </w:rPr>
-        <w:t xml:space="preserve">initializing key variables and data structures. As mention before, each datapoint is a temperature timestamp pair where the temperature is an unsigned 8-bit integer and the timestamp is an unsigned 16-bit integer. This gives us a temperature range of 0-255 Fahrenheit and a timestamp range of 0-65536. Our expected temperature readings are not expected to go past 170F, leaving us a good margin of safety. </w:t>
-      </w:r>
-    </w:p>
-    <w:p>
-      <w:pPr>
-        <w:rPr>
-          <w:rFonts w:ascii="Times New Roman" w:hAnsi="Times New Roman" w:cs="Times New Roman"/>
-        </w:rPr>
-      </w:pPr>
-      <w:r>
-        <w:rPr>
-          <w:rFonts w:ascii="Times New Roman" w:hAnsi="Times New Roman" w:cs="Times New Roman"/>
-        </w:rPr>
-        <w:t xml:space="preserve">The probe is controlled by a single button. A short press of the button will begin a testing sequence </w:t>
-      </w:r>
-      <w:r>
-        <w:rPr>
-          <w:rFonts w:ascii="Times New Roman" w:hAnsi="Times New Roman" w:cs="Times New Roman"/>
-        </w:rPr>
-        <w:t>while</w:t>
-      </w:r>
-      <w:r>
-        <w:rPr>
-          <w:rFonts w:ascii="Times New Roman" w:hAnsi="Times New Roman" w:cs="Times New Roman"/>
-        </w:rPr>
-        <w:t xml:space="preserve"> holding the button for several seconds will begin data transfer. The testing sequence begins a loop of reading analog inputs from the thermistor and converting it to Fahrenheit via the Steinhart-Hart equation. These datapoints are saved into a buffer. After the buffer fills up, or the test ends, the buffer is written to the flash storage module.</w:t>
-      </w:r>
-      <w:r>
-        <w:rPr>
-          <w:rFonts w:ascii="Times New Roman" w:hAnsi="Times New Roman" w:cs="Times New Roman"/>
-        </w:rPr>
-        <w:t xml:space="preserve"> Currently, measurements are taken once per second.</w:t>
-      </w:r>
-    </w:p>
-    <w:p>
-      <w:pPr>
-        <w:rPr>
-          <w:rFonts w:ascii="Times New Roman" w:hAnsi="Times New Roman" w:cs="Times New Roman"/>
-        </w:rPr>
-      </w:pPr>
-      <w:r>
-        <w:rPr>
-          <w:rFonts w:ascii="Times New Roman" w:hAnsi="Times New Roman" w:cs="Times New Roman"/>
-        </w:rPr>
-        <w:t>The data transfer function relies on a UART serial connection to a computer. After plugging in the RX and TX pins, the Arduino can read all of the stored data from flash and print them out to a terminal on your PC for analysis.</w:t>
-      </w:r>
-    </w:p>
-    <w:p>
-      <w:pPr>
-        <w:rPr>
-          <w:rFonts w:ascii="Times New Roman" w:hAnsi="Times New Roman" w:cs="Times New Roman"/>
-        </w:rPr>
-      </w:pPr>
-    </w:p>
-    <w:p>
-      <w:pPr>
-        <w:pStyle w:val="Heading1"/>
-      </w:pPr>
-      <w:bookmarkStart w:id="10" w:name="_Toc213933301"/>
-      <w:r>
-        <w:t>Future Improvements</w:t>
-      </w:r>
-      <w:bookmarkEnd w:id="10"/>
-    </w:p>
-    <w:p>
-      <w:pPr>
-        <w:pStyle w:val="Heading2"/>
-      </w:pPr>
-      <w:bookmarkStart w:id="11" w:name="_Toc213933302"/>
-      <w:r>
-        <w:t>Code Improvements</w:t>
-      </w:r>
-      <w:bookmarkEnd w:id="11"/>
-    </w:p>
-    <w:p>
-      <w:pPr>
-        <w:rPr>
-          <w:rFonts w:ascii="Times New Roman" w:hAnsi="Times New Roman" w:cs="Times New Roman"/>
-        </w:rPr>
-      </w:pPr>
-      <w:r>
-        <w:rPr>
-          <w:rFonts w:ascii="Times New Roman" w:hAnsi="Times New Roman" w:cs="Times New Roman"/>
-        </w:rPr>
-        <w:t>There are several areas in which the code can be improved. Right now, the constants used for the Steinhart-Hart equation are general ones for the given 10kOhm resistor and 10kOhm thermistor pair. To get a more accurate Fahrenheit reading, it would be better to calibrate these constants. For the purposes of measuring the decay in thermal energy, this isn’t as critical, but would help provide more useful information.</w:t>
-      </w:r>
-    </w:p>
-    <w:p>
-      <w:pPr>
-        <w:pStyle w:val="Heading2"/>
-      </w:pPr>
-      <w:r>
         <w:t>Probe Improvements</w:t>
       </w:r>
     </w:p>
@@ -1578,7 +1690,19 @@
         <w:rPr>
           <w:rFonts w:ascii="Times New Roman" w:hAnsi="Times New Roman" w:cs="Times New Roman"/>
         </w:rPr>
-        <w:t>The case currently has a lid that clips on to the top, limiting the debris that can get into it. The clips that stick out from the case also serve to keep the case within the spokes of the wheels. There is also a slot in the lid and case to allow for a zip tie to go through to further attach the case to the wheel. Using a zip tie would make usage of the device more cumbersome and make it difficult to get the information off of the probe. Designing a case that better molds to the shape of the spokes would help reduce the need for the zip tie. Due to the slight differences in rim design, this would restrict which wheels the probe can be used on. A more robust attachment method would benefit the device greatly.</w:t>
+        <w:t xml:space="preserve">The case currently has a lid that clips on to the top, limiting the debris that can get into it. The clips that stick out from the case also serve to keep the case within the spokes of the wheels. Designing a case that better molds to the shape of the spokes would help </w:t>
+      </w:r>
+      <w:r>
+        <w:rPr>
+          <w:rFonts w:ascii="Times New Roman" w:hAnsi="Times New Roman" w:cs="Times New Roman"/>
+        </w:rPr>
+        <w:t>prevent rattling and ensure a secure fit</w:t>
+      </w:r>
+      <w:r>
+        <w:rPr>
+          <w:rFonts w:ascii="Times New Roman" w:hAnsi="Times New Roman" w:cs="Times New Roman"/>
+        </w:rPr>
+        <w:t>. Due to the slight differences in rim design, this would restrict which wheels the probe can be used on. A more robust attachment method would benefit the device greatly.</w:t>
       </w:r>
     </w:p>
     <w:sectPr>

</xml_diff>